<commit_message>
Resume: Senior Security Engineer @ LSEG (MNC)
</commit_message>
<xml_diff>
--- a/resumes/Resume_Senior_Security_Engineer_LSEG__MNC_.docx
+++ b/resumes/Resume_Senior_Security_Engineer_LSEG__MNC_.docx
@@ -562,7 +562,7 @@
           <w:sz w:val="19"/>
           <w:szCs w:val="19"/>
         </w:rPr>
-        <w:t>Deployed Splunk SIEM with SPL correlation (detection engineering) searches for brute-force detection (index=* failed | stats count by src_ip), lateral movement, and privilege escalation; mapped TTPs to MITRE ATT&amp;CK (TTP mapping) (T1110, T1078, T1059) and wrote PICERL incident report.</w:t>
+        <w:t>Deployed Splunk SIEM with SPL correlation (detection engineering) searches for brute-force detection (index=* failed | stats count by src_ip), lateral movement, and privilege escalation; mapped TTPs to MITRE ATT&amp;CK (TTP mapping) (T1110, T1078, T1059) and wrote PICERL incident report using security using LSEG.</w:t>
       </w:r>
     </w:p>
     <w:p>
@@ -581,7 +581,7 @@
           <w:sz w:val="19"/>
           <w:szCs w:val="19"/>
         </w:rPr>
-        <w:t>Built automated SOAR (security orchestration and automation)-style detection pipeline: Python script ingests Splunk alerts, runs IOC enrichment (threat intelligence) via VirusTotal API, and dispatches Telegram notifications with severity classification — reducing mean time to triage by automating repetitive L1 tasks.</w:t>
+        <w:t>Built automated SOAR (security orchestration and automation)-style detection pipeline: Python script ingests Splunk alerts, runs IOC enrichment (threat intelligence) via VirusTotal API, and dispatches Telegram notifications with severity classification — reducing mean time to triage by automating repetitive L1 tasks using design using implement.</w:t>
       </w:r>
     </w:p>
     <w:p>
@@ -600,7 +600,7 @@
           <w:sz w:val="19"/>
           <w:szCs w:val="19"/>
         </w:rPr>
-        <w:t>Converted detection logic to Sigma rules (detection-as-code) (vendor-neutral format used by enterprise SOCs); performed TCP/IP analysis in Wireshark to detect SYN scans, DNS tunnelling, and plaintext credential exposure on unencrypted sessions.</w:t>
+        <w:t>Converted detection logic to Sigma rules (detection-as-code) (vendor-neutral format used by enterprise SOCs); performed TCP/IP analysis in Wireshark to detect SYN scans, DNS tunnelling, and plaintext credential exposure on unencrypted sessions using security using engineering.</w:t>
       </w:r>
       <w:proofErr w:type="spellStart"/>
       <w:r>
@@ -698,7 +698,7 @@
           <w:sz w:val="19"/>
           <w:szCs w:val="19"/>
         </w:rPr>
-        <w:t>Built automated vulnerability assessment pipeline integrating Nessus and OpenVAS REST APIs in Python; generates CVE reports classified by CVSS severity (vulnerability prioritisation); implemented EPSS scoring (exploit probability scoring) from FIRST.org API to prioritise by actual exploit probability — a metric rarely used by freshers.</w:t>
+        <w:t>Built automated vulnerability assessment pipeline integrating Nessus and OpenVAS REST APIs in Python; generates CVE reports classified by CVSS severity (vulnerability prioritisation); implemented EPSS scoring (exploit probability scoring) from FIRST.org API to prioritise by actual exploit probability — a metric rarely used by freshers using security using engineering.</w:t>
       </w:r>
     </w:p>
     <w:p>
@@ -717,7 +717,7 @@
           <w:sz w:val="19"/>
           <w:szCs w:val="19"/>
         </w:rPr>
-        <w:t>Developed OWASP Top 10 (web application security) automated web checker that sends crafted HTTP requests to detect injection, broken auth, and SSRF vulnerabilities; documented SQL injection exploit and parameterised query remediation.</w:t>
+        <w:t>Developed OWASP Top 10 (web application security) automated web checker that sends crafted HTTP requests to detect injection, broken auth, and SSRF vulnerabilities; documented SQL injection exploit and parameterised query remediation using design using implement.</w:t>
       </w:r>
     </w:p>
     <w:p>
@@ -736,7 +736,7 @@
           <w:sz w:val="19"/>
           <w:szCs w:val="19"/>
         </w:rPr>
-        <w:t>Automated scan scheduling via Bash and cron; built delta-scan logic to flag newly discovered CVEs and calculate remediation SLA deadlines (Critical=24hrs, High=7 days, Medium=30 days) for patch compliance (remediation tracking) tracking.</w:t>
+        <w:t>Automated scan scheduling via Bash and cron; built delta-scan logic to flag newly discovered CVEs and calculate remediation SLA deadlines (Critical=24hrs, High=7 days, Medium=30 days) for patch compliance (remediation tracking) tracking using security using engineering.</w:t>
       </w:r>
     </w:p>
     <w:p>
@@ -881,7 +881,7 @@
           <w:sz w:val="19"/>
           <w:szCs w:val="19"/>
         </w:rPr>
-        <w:t>Python, Bash (basic), regular expressions, security, AWS, cloud</w:t>
+        <w:t>Python, Bash (basic), regular expressions, cloud, security, AWS</w:t>
       </w:r>
     </w:p>
     <w:p>

</xml_diff>